<commit_message>
BSI.IT.27.C7: re-perform testing with the 10/01/2026 evidence package
Adds the new evidence package (BSI.IT.27.C7 New Testing Evidences-10-1--2026)
as the source location and replaces the superseded IAM Standard v10.0.
Testing now covers two samples (2026 Q1 and 2026 Q2) and uses the BSI AD
extract (05/15/2026): completeness 58/58 (A2 pass), 2026 Q1 review evidenced
(A1 pass with 2025 Q4 observation), 2026 Q1 revocations removed within SLA,
and A5 exceptions confirmed by AD (disabled / expired accounts approved,
X533062 added). Updates WP2, the step-by-step walkthrough (.05), the
Q2_2026 evidence workbook (sources + update tab) and the sample of 1.

Co-Authored-By: Claude Opus 5.5 <noreply@anthropic.com>
Claude-Session: https://claude.ai/code/session_01GtAt3iBzX5VYFEMTgXwPkP
</commit_message>
<xml_diff>
--- a/BSI.IT.27.C7 Network Device Admin Accoun/BSI.IT.27.C7.04 Sample of 1 - 2026 Q2 Network Device Admin Account Review.docx
+++ b/BSI.IT.27.C7 Network Device Admin Accoun/BSI.IT.27.C7.04 Sample of 1 - 2026 Q2 Network Device Admin Account Review.docx
@@ -157,7 +157,7 @@
                 <w:color w:val="C00000"/>
                 <w:sz w:val="26"/>
               </w:rPr>
-              <w:t>3 (E1-E3)</w:t>
+              <w:t>3 TYPES (E1-E3)</w:t>
             </w:r>
           </w:p>
         </w:tc>
@@ -492,6 +492,61 @@
                 <w:color w:val="334155"/>
                 <w:sz w:val="18"/>
               </w:rPr>
+              <w:t xml:space="preserve">Updated</w:t>
+            </w:r>
+          </w:p>
+        </w:tc>
+        <w:tc>
+          <w:tcPr>
+            <w:tcW w:w="5112" w:type="dxa"/>
+            <w:tcMar>
+              <w:top w:w="110" w:type="dxa"/>
+              <w:left w:w="110" w:type="dxa"/>
+              <w:bottom w:w="110" w:type="dxa"/>
+              <w:right w:w="110" w:type="dxa"/>
+            </w:tcMar>
+            <w:vAlign w:val="center"/>
+          </w:tcPr>
+          <w:p>
+            <w:pPr>
+              <w:spacing w:after="0" w:line="240" w:lineRule="auto"/>
+            </w:pPr>
+            <w:r>
+              <w:rPr>
+                <w:sz w:val="18"/>
+              </w:rPr>
+              <w:t xml:space="preserve">October 1, 2026 - new evidence: AD extract 05/15/2026, 2026 Q1 certification, IAM Standard v11.0, PAM Recertification Procedure v2.0</w:t>
+            </w:r>
+          </w:p>
+        </w:tc>
+      </w:tr>
+      <w:tr>
+        <w:trPr>
+          <w:cantSplit/>
+          <w:jc w:val="center"/>
+        </w:trPr>
+        <w:tc>
+          <w:tcPr>
+            <w:tcW w:w="5112" w:type="dxa"/>
+            <w:shd w:val="clear" w:color="auto" w:fill="F1F5F9"/>
+            <w:tcMar>
+              <w:top w:w="110" w:type="dxa"/>
+              <w:left w:w="110" w:type="dxa"/>
+              <w:bottom w:w="110" w:type="dxa"/>
+              <w:right w:w="110" w:type="dxa"/>
+            </w:tcMar>
+            <w:vAlign w:val="center"/>
+          </w:tcPr>
+          <w:p>
+            <w:pPr>
+              <w:spacing w:after="0" w:line="240" w:lineRule="auto"/>
+            </w:pPr>
+            <w:r>
+              <w:rPr>
+                <w:b/>
+                <w:color w:val="334155"/>
+                <w:sz w:val="18"/>
+              </w:rPr>
               <w:t xml:space="preserve">Overall conclusion</w:t>
             </w:r>
           </w:p>
@@ -516,7 +571,7 @@
                 <w:sz w:val="18"/>
                 <w:color w:val="C00000"/>
               </w:rPr>
-              <w:t xml:space="preserve">Not compliant - exceptions E1-E3 (preliminary, pending management response)</w:t>
+              <w:t xml:space="preserve">Not compliant - exceptions E1-E3 confirmed by Active Directory (pending management response)</w:t>
             </w:r>
           </w:p>
         </w:tc>
@@ -541,7 +596,7 @@
     </w:p>
     <w:p>
       <w:r>
-        <w:t xml:space="preserve">IT RCSA reviewed the 2026 Q2 PAM BSI SOX access certification for the four privileged network AD groups defined in section 3.3 of the PAM Definition of Privilege (CISCO ISE Administrators, CISCO Network Administrators, ISEAdmin and F5FullAdmin), the supporting CyberArk certifications, the 2025 Q2 certifications and the 2025 Q3 evidence. All 58 memberships (48 users / administrators and 10 service accounts) were included in the certification, reviewed by the user's manager or the account owner, and received a final decision. However, 30 memberships were approved although the identity was flagged inactive in IAMS (E1), carried an IAMS termination date of 12/31/2024 (E2), or had been revoked in the 2025 Q3 review and was re-granted without supporting approval (E3). The 2025 Q4 and 2026 Q1 certifications were not provided to confirm the semiannual frequency. The sample assessment result is Fail.</w:t>
+        <w:t xml:space="preserve">IT RCSA reviewed the 2026 Q2 PAM BSI SOX access certification for the four privileged network AD groups defined in section 3.3 of the PAM Definition of Privilege (CISCO ISE Administrators, CISCO Network Administrators, ISEAdmin and F5FullAdmin), the supporting CyberArk certifications, the 2025 Q2 certifications and the 2025 Q3 evidence, updated on October 1, 2026 with the BSI Active Directory extract (05/15/2026), the 2026 Q1 certification, the CUSO IAM Standard v11.0 and the PAM Recertification Procedure v2.0. All 58 memberships (48 users / administrators and 10 service accounts) were included in the certification - the AD membership of the four groups agrees 58/58 - reviewed by the user's manager or the account owner, and received a final decision. However, 32 memberships were approved although the account was disabled in AD or the identity was inactive in IAMS (E1), the identity had an IAMS termination date of 12/31/2024 or the AD account expired on 06/01/2026 (E2), or the membership had been revoked in the 2025 Q3 review and was re-granted without supporting approval (E3). Reviews were performed in April and July 2026 (2025 Q4 not evidenced). The sample assessment result is Fail.</w:t>
       </w:r>
     </w:p>
     <w:p>
@@ -1274,7 +1329,7 @@
               <w:rPr>
                 <w:sz w:val="16"/>
               </w:rPr>
-              <w:t xml:space="preserve">Certification campaigns evidenced for 2025 Q2 (May 2025), 2025 Q3 (August 2025) and 2026 Q2 (July-August 2026). 2025 Q4 and 2026 Q1 not provided.</w:t>
+              <w:t xml:space="preserve">Certification campaigns evidenced for 2025 Q1, Q2, Q3, 2026 Q1 (launched April 9, 2026) and 2026 Q2 (launched July 22, 2026). 2025 Q4 not provided.</w:t>
             </w:r>
           </w:p>
         </w:tc>
@@ -1300,7 +1355,7 @@
                 <w:sz w:val="16"/>
                 <w:color w:val="B45F06"/>
               </w:rPr>
-              <w:t xml:space="preserve">Pending</w:t>
+              <w:t xml:space="preserve">Pass (observation)</w:t>
             </w:r>
           </w:p>
         </w:tc>
@@ -1324,7 +1379,7 @@
               <w:rPr>
                 <w:sz w:val="16"/>
               </w:rPr>
-              <w:t xml:space="preserve">The semiannual frequency cannot be confirmed for the period between the 2025 Q3 and 2026 Q2 reviews.</w:t>
+              <w:t xml:space="preserve">Reviews performed at least semiannually in 2026; 2025 Q4 not evidenced (8.3 months between the 2025 Q3 and 2026 Q1 launches).</w:t>
             </w:r>
           </w:p>
         </w:tc>
@@ -1428,7 +1483,7 @@
               <w:rPr>
                 <w:sz w:val="16"/>
               </w:rPr>
-              <w:t xml:space="preserve">Certification population is complete; current AD extract pending. Network_support (PAM Definition 3.2) outside the control scope.</w:t>
+              <w:t xml:space="preserve">AD extract 05/15/2026 members agree 58/58 with the certified memberships. Network_support (PAM Definition 3.2) outside the control scope.</w:t>
             </w:r>
           </w:p>
         </w:tc>
@@ -1690,7 +1745,7 @@
               <w:rPr>
                 <w:sz w:val="16"/>
               </w:rPr>
-              <w:t xml:space="preserve">CyberArk identity status and 2025 Q3 decisions compared to approved memberships: E1 - 5 inactive identities; E2 - 8 identities with termination date 12/31/2024; E3 - 6 memberships re-granted after 2025 Q3 revocation.</w:t>
+              <w:t xml:space="preserve">IAMS identity status, AD account status (05/15/2026) and 2025 Q3 decisions compared to approved memberships: E1 - 10 accounts disabled in AD or inactive in IAMS (incl. X533062); E2 - 9 accounts terminated in IAMS / expired in AD on 06/01/2026; E3 - 6 memberships re-granted after 2025 Q3 revocation.</w:t>
             </w:r>
           </w:p>
         </w:tc>
@@ -1740,7 +1795,7 @@
               <w:rPr>
                 <w:sz w:val="16"/>
               </w:rPr>
-              <w:t xml:space="preserve">30 memberships approved inappropriately or without support (CISCO Network Administrators 16, ISEAdmin 14).</w:t>
+              <w:t xml:space="preserve">32 memberships approved inappropriately or without support (CISCO Network Administrators 17, ISEAdmin 15).</w:t>
             </w:r>
           </w:p>
         </w:tc>
@@ -1794,7 +1849,7 @@
               <w:rPr>
                 <w:sz w:val="16"/>
               </w:rPr>
-              <w:t xml:space="preserve">No revocations in 2026 Q2. 2025 Q2 revocations (10) completed and absent in 2025 Q3; 2025 Q3 revocations removed 9/2-9/8/2025 per Netwrix.</w:t>
+              <w:t xml:space="preserve">No revocations in 2026 Q2. 2026 Q1 revocations (N596764, MIAYPER) removed in 0-1 day per Netwrix and absent from AD; 2025 Q2 / Q3 revocations removed within SLA.</w:t>
             </w:r>
           </w:p>
         </w:tc>
@@ -2132,7 +2187,7 @@
                 <w:color w:val="17365D"/>
                 <w:sz w:val="16"/>
               </w:rPr>
-              <w:t xml:space="preserve">NETWORK ADMINS</w:t>
+              <w:t xml:space="preserve">7_Update 10-01-2026</w:t>
             </w:r>
           </w:p>
         </w:tc>
@@ -2157,7 +2212,7 @@
                 <w:color w:val="1F1F1F"/>
                 <w:sz w:val="16"/>
               </w:rPr>
-              <w:t xml:space="preserve">Extract of the PAM Definition of Privilege v10.0 (March 2025), section 3.3 Network Administration, listing the four privileged network AD groups, with tester notes.</w:t>
+              <w:t xml:space="preserve">AD status (05/15/2026) of every 2026 Q2 membership with the updated A5 result, and the list of changes to the conclusions from the new evidence.</w:t>
             </w:r>
           </w:p>
         </w:tc>
@@ -2182,7 +2237,7 @@
                 <w:color w:val="1F1F1F"/>
                 <w:sz w:val="16"/>
               </w:rPr>
-              <w:t xml:space="preserve">Confirms the groups in scope for the review. Compare to Appendix A and BSI.IT.27.C7.03 PAM Definition of Privilege.</w:t>
+              <w:t xml:space="preserve">Supports the updated A2 and A5 conclusions; traceable to Exhibits B5 and C3.</w:t>
             </w:r>
           </w:p>
         </w:tc>
@@ -2214,7 +2269,7 @@
                 <w:color w:val="17365D"/>
                 <w:sz w:val="16"/>
               </w:rPr>
-              <w:t xml:space="preserve">1_Cisco ISE Administrators</w:t>
+              <w:t xml:space="preserve">NETWORK ADMINS</w:t>
             </w:r>
           </w:p>
         </w:tc>
@@ -2239,7 +2294,7 @@
                 <w:color w:val="1F1F1F"/>
                 <w:sz w:val="16"/>
               </w:rPr>
-              <w:t xml:space="preserve">Full 2026 Q2 SOX Manager and Entitlement Owner certification exports with the group's memberships highlighted; AD extract section (pending).</w:t>
+              <w:t xml:space="preserve">Extract of the PAM Definition of Privilege v10.0 (March 2025), section 3.3 Network Administration, listing the four privileged network AD groups, with tester notes.</w:t>
             </w:r>
           </w:p>
         </w:tc>
@@ -2264,7 +2319,7 @@
                 <w:color w:val="1F1F1F"/>
                 <w:sz w:val="16"/>
               </w:rPr>
-              <w:t xml:space="preserve">3 memberships (1 person, 2 service) certified and Approved; no exceptions.</w:t>
+              <w:t xml:space="preserve">Confirms the groups in scope for the review. Compare to Appendix A and BSI.IT.27.C7.03 PAM Definition of Privilege.</w:t>
             </w:r>
           </w:p>
         </w:tc>
@@ -2296,7 +2351,7 @@
                 <w:color w:val="17365D"/>
                 <w:sz w:val="16"/>
               </w:rPr>
-              <w:t xml:space="preserve">2_Cisco Network Administrators</w:t>
+              <w:t xml:space="preserve">1_Cisco ISE Administrators</w:t>
             </w:r>
           </w:p>
         </w:tc>
@@ -2321,7 +2376,7 @@
                 <w:color w:val="1F1F1F"/>
                 <w:sz w:val="16"/>
               </w:rPr>
-              <w:t xml:space="preserve">Same layout; "EXCEPTIONS" USERS EVIDENCE section with CyberArk identity-status rows for each exception.</w:t>
+              <w:t xml:space="preserve">Full 2026 Q2 SOX Manager and Entitlement Owner certification exports with the group's memberships highlighted; AD extract section (pending).</w:t>
             </w:r>
           </w:p>
         </w:tc>
@@ -2346,7 +2401,7 @@
                 <w:color w:val="1F1F1F"/>
                 <w:sz w:val="16"/>
               </w:rPr>
-              <w:t xml:space="preserve">28 memberships; 16 exceptions (E1, E2, E3). Traceable to Appendix B, Exhibits B1, B3 and B4.</w:t>
+              <w:t xml:space="preserve">3 memberships (1 person, 2 service) certified and Approved; no exceptions.</w:t>
             </w:r>
           </w:p>
         </w:tc>
@@ -2378,7 +2433,7 @@
                 <w:color w:val="17365D"/>
                 <w:sz w:val="16"/>
               </w:rPr>
-              <w:t xml:space="preserve">3_ISEAdmin</w:t>
+              <w:t xml:space="preserve">2_Cisco Network Administrators</w:t>
             </w:r>
           </w:p>
         </w:tc>
@@ -2403,7 +2458,7 @@
                 <w:color w:val="1F1F1F"/>
                 <w:sz w:val="16"/>
               </w:rPr>
-              <w:t xml:space="preserve">Same layout; "EXCEPTIONS" USERS EVIDENCE section.</w:t>
+              <w:t xml:space="preserve">Same layout; "EXCEPTIONS" USERS EVIDENCE section with CyberArk identity-status rows for each exception.</w:t>
             </w:r>
           </w:p>
         </w:tc>
@@ -2428,7 +2483,7 @@
                 <w:color w:val="1F1F1F"/>
                 <w:sz w:val="16"/>
               </w:rPr>
-              <w:t xml:space="preserve">23 memberships; 14 exceptions (E1, E2, E3). Traceable to Appendix B.</w:t>
+              <w:t xml:space="preserve">28 memberships; 17 exceptions (E1, E2, E3). Traceable to Appendix B, Exhibits B1, B3 and B4.</w:t>
             </w:r>
           </w:p>
         </w:tc>
@@ -2460,7 +2515,7 @@
                 <w:color w:val="17365D"/>
                 <w:sz w:val="16"/>
               </w:rPr>
-              <w:t xml:space="preserve">4_F5FullAdmin</w:t>
+              <w:t xml:space="preserve">3_ISEAdmin</w:t>
             </w:r>
           </w:p>
         </w:tc>
@@ -2485,7 +2540,7 @@
                 <w:color w:val="1F1F1F"/>
                 <w:sz w:val="16"/>
               </w:rPr>
-              <w:t xml:space="preserve">Same layout.</w:t>
+              <w:t xml:space="preserve">Same layout; "EXCEPTIONS" USERS EVIDENCE section.</w:t>
             </w:r>
           </w:p>
         </w:tc>
@@ -2510,7 +2565,7 @@
                 <w:color w:val="1F1F1F"/>
                 <w:sz w:val="16"/>
               </w:rPr>
-              <w:t xml:space="preserve">4 memberships (2 person, 2 service) certified and Approved; no exceptions.</w:t>
+              <w:t xml:space="preserve">23 memberships; 15 exceptions (E1, E2, E3). Traceable to Appendix B.</w:t>
             </w:r>
           </w:p>
         </w:tc>
@@ -2542,7 +2597,7 @@
                 <w:color w:val="17365D"/>
                 <w:sz w:val="16"/>
               </w:rPr>
-              <w:t xml:space="preserve">5-SailPoint Reports</w:t>
+              <w:t xml:space="preserve">4_F5FullAdmin</w:t>
             </w:r>
           </w:p>
         </w:tc>
@@ -2567,7 +2622,7 @@
                 <w:color w:val="1F1F1F"/>
                 <w:sz w:val="16"/>
               </w:rPr>
-              <w:t xml:space="preserve">List of the certification reports used, pending items (AD extract, Netwrix logs, screenshots) and the inventory of all 8 evidence files.</w:t>
+              <w:t xml:space="preserve">Same layout.</w:t>
             </w:r>
           </w:p>
         </w:tc>
@@ -2592,7 +2647,7 @@
                 <w:color w:val="1F1F1F"/>
                 <w:sz w:val="16"/>
               </w:rPr>
-              <w:t xml:space="preserve">Confirms every file in the evidence package was inspected and where it is used.</w:t>
+              <w:t xml:space="preserve">4 memberships (2 person, 2 service) certified and Approved; no exceptions.</w:t>
             </w:r>
           </w:p>
         </w:tc>
@@ -2624,7 +2679,7 @@
                 <w:color w:val="17365D"/>
                 <w:sz w:val="16"/>
               </w:rPr>
-              <w:t xml:space="preserve">6_Attribute Testing</w:t>
+              <w:t xml:space="preserve">5-SailPoint Reports</w:t>
             </w:r>
           </w:p>
         </w:tc>
@@ -2649,6 +2704,88 @@
                 <w:color w:val="1F1F1F"/>
                 <w:sz w:val="16"/>
               </w:rPr>
+              <w:t xml:space="preserve">List of the certification reports used, pending items (AD extract, Netwrix logs, screenshots) and the inventory of all 8 evidence files.</w:t>
+            </w:r>
+          </w:p>
+        </w:tc>
+        <w:tc>
+          <w:tcPr>
+            <w:tcW w:w="3528" w:type="dxa"/>
+            <w:shd w:val="clear" w:color="auto" w:fill="FFFFFF"/>
+            <w:tcMar>
+              <w:top w:w="75" w:type="dxa"/>
+              <w:left w:w="85" w:type="dxa"/>
+              <w:bottom w:w="75" w:type="dxa"/>
+              <w:right w:w="85" w:type="dxa"/>
+            </w:tcMar>
+            <w:vAlign w:val="center"/>
+          </w:tcPr>
+          <w:p>
+            <w:pPr>
+              <w:spacing w:after="0"/>
+            </w:pPr>
+            <w:r>
+              <w:rPr>
+                <w:color w:val="1F1F1F"/>
+                <w:sz w:val="16"/>
+              </w:rPr>
+              <w:t xml:space="preserve">Confirms every file in the evidence package was inspected and where it is used.</w:t>
+            </w:r>
+          </w:p>
+        </w:tc>
+      </w:tr>
+      <w:tr>
+        <w:trPr>
+          <w:cantSplit/>
+          <w:jc w:val="center"/>
+        </w:trPr>
+        <w:tc>
+          <w:tcPr>
+            <w:tcW w:w="2232" w:type="dxa"/>
+            <w:shd w:val="clear" w:color="auto" w:fill="F7F9FC"/>
+            <w:tcMar>
+              <w:top w:w="75" w:type="dxa"/>
+              <w:left w:w="85" w:type="dxa"/>
+              <w:bottom w:w="75" w:type="dxa"/>
+              <w:right w:w="85" w:type="dxa"/>
+            </w:tcMar>
+            <w:vAlign w:val="center"/>
+          </w:tcPr>
+          <w:p>
+            <w:pPr>
+              <w:spacing w:after="0"/>
+            </w:pPr>
+            <w:r>
+              <w:rPr>
+                <w:b/>
+                <w:color w:val="17365D"/>
+                <w:sz w:val="16"/>
+              </w:rPr>
+              <w:t xml:space="preserve">6_Attribute Testing</w:t>
+            </w:r>
+          </w:p>
+        </w:tc>
+        <w:tc>
+          <w:tcPr>
+            <w:tcW w:w="4680" w:type="dxa"/>
+            <w:shd w:val="clear" w:color="auto" w:fill="F7F9FC"/>
+            <w:tcMar>
+              <w:top w:w="75" w:type="dxa"/>
+              <w:left w:w="85" w:type="dxa"/>
+              <w:bottom w:w="75" w:type="dxa"/>
+              <w:right w:w="85" w:type="dxa"/>
+            </w:tcMar>
+            <w:vAlign w:val="center"/>
+          </w:tcPr>
+          <w:p>
+            <w:pPr>
+              <w:spacing w:after="0"/>
+            </w:pPr>
+            <w:r>
+              <w:rPr>
+                <w:color w:val="1F1F1F"/>
+                <w:sz w:val="16"/>
+              </w:rPr>
               <w:t xml:space="preserve">Attributes A1-A7 with policy criteria, procedures and results; item testing of all 58 memberships; timeline; SOX vs CyberArk reconciliation; revocation roll-forward.</w:t>
             </w:r>
           </w:p>
@@ -2656,7 +2793,7 @@
         <w:tc>
           <w:tcPr>
             <w:tcW w:w="3528" w:type="dxa"/>
-            <w:shd w:val="clear" w:color="auto" w:fill="FFFFFF"/>
+            <w:shd w:val="clear" w:color="auto" w:fill="F7F9FC"/>
             <w:tcMar>
               <w:top w:w="75" w:type="dxa"/>
               <w:left w:w="85" w:type="dxa"/>
@@ -2732,7 +2869,7 @@
           <w:color w:val="1F1F1F"/>
           <w:sz w:val="17"/>
         </w:rPr>
-        <w:t xml:space="preserve">Exception path: CyberArk Manager certification identity status and BSI.IT.27.C7.02 Q3_2025 revocations -&gt; "EXCEPTIONS" USERS EVIDENCE (Tabs 2-3) -&gt; Exhibits B3 and B4.</w:t>
+        <w:t xml:space="preserve">Exception path: CyberArk identity status, AD extract 05/15/2026 and BSI.IT.27.C7.02 Q3_2025 revocations -&gt; "EXCEPTIONS" USERS EVIDENCE (Tabs 2-3) and 7_Update tab -&gt; Exhibits B3, B4 and B5.</w:t>
       </w:r>
     </w:p>
     <w:p>
@@ -2969,7 +3106,7 @@
               <w:rPr>
                 <w:sz w:val="17"/>
               </w:rPr>
-              <w:t xml:space="preserve">BSI.IT.27.C7.01 IAM Standard.pdf</w:t>
+              <w:t xml:space="preserve">BSI.IT.27.C7 New Testing Evidences-10-1--2026 / BSI.IT.27.C7.01 Identity and Access Management Standard (CUSO) 07.28.26.pdf (v11.0)</w:t>
             </w:r>
           </w:p>
         </w:tc>
@@ -3047,7 +3184,163 @@
               <w:rPr>
                 <w:sz w:val="17"/>
               </w:rPr>
-              <w:t xml:space="preserve">2026 Q2 PAM BSI SOX / CyberArk certification exports (4 CSV files)</w:t>
+              <w:t xml:space="preserve">BSI.IT.27.C7 New Testing Evidences-10-1--2026 / PAM Recertification Procedure (BSI) 04.22.26.pdf (v2.0)</w:t>
+            </w:r>
+          </w:p>
+        </w:tc>
+        <w:tc>
+          <w:tcPr>
+            <w:tcW w:w="3408" w:type="dxa"/>
+            <w:shd w:val="clear" w:color="auto" w:fill="F8FAFC"/>
+            <w:tcMar>
+              <w:top w:w="110" w:type="dxa"/>
+              <w:left w:w="110" w:type="dxa"/>
+              <w:bottom w:w="110" w:type="dxa"/>
+              <w:right w:w="110" w:type="dxa"/>
+            </w:tcMar>
+            <w:vAlign w:val="center"/>
+          </w:tcPr>
+          <w:p>
+            <w:pPr>
+              <w:spacing w:after="0" w:line="240" w:lineRule="auto"/>
+            </w:pPr>
+            <w:r>
+              <w:rPr>
+                <w:sz w:val="17"/>
+              </w:rPr>
+              <w:t xml:space="preserve">Procedure criteria</w:t>
+            </w:r>
+          </w:p>
+        </w:tc>
+        <w:tc>
+          <w:tcPr>
+            <w:tcW w:w="3408" w:type="dxa"/>
+            <w:shd w:val="clear" w:color="auto" w:fill="F8FAFC"/>
+            <w:tcMar>
+              <w:top w:w="110" w:type="dxa"/>
+              <w:left w:w="110" w:type="dxa"/>
+              <w:bottom w:w="110" w:type="dxa"/>
+              <w:right w:w="110" w:type="dxa"/>
+            </w:tcMar>
+            <w:vAlign w:val="center"/>
+          </w:tcPr>
+          <w:p>
+            <w:pPr>
+              <w:spacing w:after="0" w:line="240" w:lineRule="auto"/>
+            </w:pPr>
+            <w:r>
+              <w:rPr>
+                <w:sz w:val="17"/>
+              </w:rPr>
+              <w:t xml:space="preserve">Control C7 (sec. 8.1); quarterly SOX recertification by line manager / owner; revocation for rejected or terminated users and PAM verification (sec. 8 steps 9-10).</w:t>
+            </w:r>
+          </w:p>
+        </w:tc>
+      </w:tr>
+      <w:tr>
+        <w:trPr>
+          <w:cantSplit/>
+          <w:jc w:val="center"/>
+        </w:trPr>
+        <w:tc>
+          <w:tcPr>
+            <w:tcW w:w="3408" w:type="dxa"/>
+            <w:shd w:val="clear" w:color="auto" w:fill="FFFFFF" w:themeFill="background1"/>
+            <w:tcMar>
+              <w:top w:w="110" w:type="dxa"/>
+              <w:left w:w="110" w:type="dxa"/>
+              <w:bottom w:w="110" w:type="dxa"/>
+              <w:right w:w="110" w:type="dxa"/>
+            </w:tcMar>
+            <w:vAlign w:val="center"/>
+          </w:tcPr>
+          <w:p>
+            <w:pPr>
+              <w:spacing w:after="0" w:line="240" w:lineRule="auto"/>
+            </w:pPr>
+            <w:r>
+              <w:rPr>
+                <w:sz w:val="17"/>
+              </w:rPr>
+              <w:t xml:space="preserve">BSI.IT.27.C7 New Testing Evidences-10-1--2026 / BSI.IT.27.C7.02 Q1 2026 Cert.xlsx</w:t>
+            </w:r>
+          </w:p>
+        </w:tc>
+        <w:tc>
+          <w:tcPr>
+            <w:tcW w:w="3408" w:type="dxa"/>
+            <w:shd w:val="clear" w:color="auto" w:fill="FFFFFF" w:themeFill="background1"/>
+            <w:tcMar>
+              <w:top w:w="110" w:type="dxa"/>
+              <w:left w:w="110" w:type="dxa"/>
+              <w:bottom w:w="110" w:type="dxa"/>
+              <w:right w:w="110" w:type="dxa"/>
+            </w:tcMar>
+            <w:vAlign w:val="center"/>
+          </w:tcPr>
+          <w:p>
+            <w:pPr>
+              <w:spacing w:after="0" w:line="240" w:lineRule="auto"/>
+            </w:pPr>
+            <w:r>
+              <w:rPr>
+                <w:sz w:val="17"/>
+              </w:rPr>
+              <w:t xml:space="preserve">AD extract 05/15/2026; 2026 Q1 review</w:t>
+            </w:r>
+          </w:p>
+        </w:tc>
+        <w:tc>
+          <w:tcPr>
+            <w:tcW w:w="3408" w:type="dxa"/>
+            <w:shd w:val="clear" w:color="auto" w:fill="FFFFFF" w:themeFill="background1"/>
+            <w:tcMar>
+              <w:top w:w="110" w:type="dxa"/>
+              <w:left w:w="110" w:type="dxa"/>
+              <w:bottom w:w="110" w:type="dxa"/>
+              <w:right w:w="110" w:type="dxa"/>
+            </w:tcMar>
+            <w:vAlign w:val="center"/>
+          </w:tcPr>
+          <w:p>
+            <w:pPr>
+              <w:spacing w:after="0" w:line="240" w:lineRule="auto"/>
+            </w:pPr>
+            <w:r>
+              <w:rPr>
+                <w:sz w:val="17"/>
+              </w:rPr>
+              <w:t xml:space="preserve">AD members and account status (enabled / expiration) for completeness and A5; 2026 Q1 certification (frequency) and Netwrix revocation logs.</w:t>
+            </w:r>
+          </w:p>
+        </w:tc>
+      </w:tr>
+      <w:tr>
+        <w:trPr>
+          <w:cantSplit/>
+          <w:jc w:val="center"/>
+        </w:trPr>
+        <w:tc>
+          <w:tcPr>
+            <w:tcW w:w="3408" w:type="dxa"/>
+            <w:shd w:val="clear" w:color="auto" w:fill="F8FAFC"/>
+            <w:tcMar>
+              <w:top w:w="110" w:type="dxa"/>
+              <w:left w:w="110" w:type="dxa"/>
+              <w:bottom w:w="110" w:type="dxa"/>
+              <w:right w:w="110" w:type="dxa"/>
+            </w:tcMar>
+            <w:vAlign w:val="center"/>
+          </w:tcPr>
+          <w:p>
+            <w:pPr>
+              <w:spacing w:after="0" w:line="240" w:lineRule="auto"/>
+            </w:pPr>
+            <w:r>
+              <w:rPr>
+                <w:sz w:val="17"/>
+              </w:rPr>
+              <w:t xml:space="preserve">BSI.IT.27.C7 New Testing Evidences-10-1--2026 / 2026 Q2 PAM BSI SOX / CyberArk certification exports (4 CSV files)</w:t>
             </w:r>
           </w:p>
         </w:tc>
@@ -3125,7 +3418,7 @@
               <w:rPr>
                 <w:sz w:val="17"/>
               </w:rPr>
-              <w:t xml:space="preserve">2025 Q2 PAM BSI SOX / CyberArk certification exports (4 CSV files)</w:t>
+              <w:t xml:space="preserve">BSI.IT.27.C7 New Testing Evidences-10-1--2026 / 2025 Q2 certification CSVs and BSI.IT.27.C7.02 Q1_2025 Cert.xlsx</w:t>
             </w:r>
           </w:p>
         </w:tc>
@@ -3173,7 +3466,7 @@
               <w:rPr>
                 <w:sz w:val="17"/>
               </w:rPr>
-              <w:t xml:space="preserve">2025 Q2 campaigns, revocations and membership baseline.</w:t>
+              <w:t xml:space="preserve">2025 Q1 and Q2 campaigns, revocations and membership baseline.</w:t>
             </w:r>
           </w:p>
         </w:tc>
@@ -3203,7 +3496,7 @@
               <w:rPr>
                 <w:sz w:val="17"/>
               </w:rPr>
-              <w:t xml:space="preserve">BSI.IT.27.C7.02 Q3_2025.xlsx (2025 Cycle 2)</w:t>
+              <w:t xml:space="preserve">BSI.IT.27.C7 New Testing Evidences-10-1--2026 / BSI.IT.27.C7.02 Q3_2025.xlsx (2025 Cycle 2)</w:t>
             </w:r>
           </w:p>
         </w:tc>
@@ -3281,7 +3574,7 @@
               <w:rPr>
                 <w:sz w:val="17"/>
               </w:rPr>
-              <w:t xml:space="preserve">BSI.IT.27.C7.02 Q2_2026.xlsx</w:t>
+              <w:t xml:space="preserve">BSI.IT.27.C7.05 Testing Walkthrough - Step by Step.xlsx</w:t>
             </w:r>
           </w:p>
         </w:tc>
@@ -3305,7 +3598,7 @@
               <w:rPr>
                 <w:sz w:val="17"/>
               </w:rPr>
-              <w:t xml:space="preserve">Population and sample traceability</w:t>
+              <w:t xml:space="preserve">Step-by-step testing (2026 Q1 and Q2)</w:t>
             </w:r>
           </w:p>
         </w:tc>
@@ -3329,7 +3622,7 @@
               <w:rPr>
                 <w:sz w:val="17"/>
               </w:rPr>
-              <w:t xml:space="preserve">Seven workbook tabs documenting scope, certification data per group, report inventory and attribute testing.</w:t>
+              <w:t xml:space="preserve">Procedure steps, attribute matrix, item detail with AD status, exceptions, sources and evidence status.</w:t>
             </w:r>
           </w:p>
         </w:tc>
@@ -3359,7 +3652,7 @@
               <w:rPr>
                 <w:sz w:val="17"/>
               </w:rPr>
-              <w:t xml:space="preserve">WP2 BSI.IT.27.C7.xlsm</w:t>
+              <w:t xml:space="preserve">BSI.IT.27.C7.02 Q2_2026.xlsx</w:t>
             </w:r>
           </w:p>
         </w:tc>
@@ -3383,6 +3676,84 @@
               <w:rPr>
                 <w:sz w:val="17"/>
               </w:rPr>
+              <w:t xml:space="preserve">Population and sample traceability</w:t>
+            </w:r>
+          </w:p>
+        </w:tc>
+        <w:tc>
+          <w:tcPr>
+            <w:tcW w:w="3408" w:type="dxa"/>
+            <w:shd w:val="clear" w:color="auto" w:fill="F8FAFC"/>
+            <w:tcMar>
+              <w:top w:w="110" w:type="dxa"/>
+              <w:left w:w="110" w:type="dxa"/>
+              <w:bottom w:w="110" w:type="dxa"/>
+              <w:right w:w="110" w:type="dxa"/>
+            </w:tcMar>
+            <w:vAlign w:val="center"/>
+          </w:tcPr>
+          <w:p>
+            <w:pPr>
+              <w:spacing w:after="0" w:line="240" w:lineRule="auto"/>
+            </w:pPr>
+            <w:r>
+              <w:rPr>
+                <w:sz w:val="17"/>
+              </w:rPr>
+              <w:t xml:space="preserve">Eight workbook tabs documenting scope, certification data per group, report inventory and attribute testing.</w:t>
+            </w:r>
+          </w:p>
+        </w:tc>
+      </w:tr>
+      <w:tr>
+        <w:trPr>
+          <w:cantSplit/>
+          <w:jc w:val="center"/>
+        </w:trPr>
+        <w:tc>
+          <w:tcPr>
+            <w:tcW w:w="3408" w:type="dxa"/>
+            <w:shd w:val="clear" w:color="auto" w:fill="FFFFFF" w:themeFill="background1"/>
+            <w:tcMar>
+              <w:top w:w="110" w:type="dxa"/>
+              <w:left w:w="110" w:type="dxa"/>
+              <w:bottom w:w="110" w:type="dxa"/>
+              <w:right w:w="110" w:type="dxa"/>
+            </w:tcMar>
+            <w:vAlign w:val="center"/>
+          </w:tcPr>
+          <w:p>
+            <w:pPr>
+              <w:spacing w:after="0" w:line="240" w:lineRule="auto"/>
+            </w:pPr>
+            <w:r>
+              <w:rPr>
+                <w:sz w:val="17"/>
+              </w:rPr>
+              <w:t xml:space="preserve">WP2 BSI.IT.27.C7.xlsm</w:t>
+            </w:r>
+          </w:p>
+        </w:tc>
+        <w:tc>
+          <w:tcPr>
+            <w:tcW w:w="3408" w:type="dxa"/>
+            <w:shd w:val="clear" w:color="auto" w:fill="FFFFFF" w:themeFill="background1"/>
+            <w:tcMar>
+              <w:top w:w="110" w:type="dxa"/>
+              <w:left w:w="110" w:type="dxa"/>
+              <w:bottom w:w="110" w:type="dxa"/>
+              <w:right w:w="110" w:type="dxa"/>
+            </w:tcMar>
+            <w:vAlign w:val="center"/>
+          </w:tcPr>
+          <w:p>
+            <w:pPr>
+              <w:spacing w:after="0" w:line="240" w:lineRule="auto"/>
+            </w:pPr>
+            <w:r>
+              <w:rPr>
+                <w:sz w:val="17"/>
+              </w:rPr>
               <w:t xml:space="preserve">Testing workpaper</w:t>
             </w:r>
           </w:p>
@@ -3390,7 +3761,7 @@
         <w:tc>
           <w:tcPr>
             <w:tcW w:w="3408" w:type="dxa"/>
-            <w:shd w:val="clear" w:color="auto" w:fill="F8FAFC"/>
+            <w:shd w:val="clear" w:color="auto" w:fill="FFFFFF" w:themeFill="background1"/>
             <w:tcMar>
               <w:top w:w="110" w:type="dxa"/>
               <w:left w:w="110" w:type="dxa"/>
@@ -3427,7 +3798,7 @@
     </w:p>
     <w:p>
       <w:r>
-        <w:t xml:space="preserve">Based on the evidence reviewed, IT RCSA concluded that the 2026 Q2 PAM BSI SOX certification covered all members of the privileged network AD groups defined in the PAM Definition of Privilege and was performed by managers and account owners with a recorded decision for every membership. However, the review approved privileged network access for identities flagged inactive or terminated in IAMS and for memberships re-granted after revocation, so inappropriate access was not identified or revoked. The 2025 Q4 and 2026 Q1 reviews were not evidenced. The control sample assessment result is Fail (preliminary, pending management response and the outstanding evidence).</w:t>
+        <w:t xml:space="preserve">Based on the evidence reviewed, IT RCSA concluded that the 2026 Q2 PAM BSI SOX certification covered all members of the privileged network AD groups defined in the PAM Definition of Privilege and was performed by managers and account owners with a recorded decision for every membership. However, the review approved privileged network access for accounts disabled or expired in Active Directory, identities inactive or terminated in IAMS and memberships re-granted after revocation, so inappropriate access was not identified or revoked. The same accounts were also approved in the 2026 Q1 review. The control sample assessment result is Fail, pending management response.</w:t>
       </w:r>
     </w:p>
     <w:p>
@@ -3859,6 +4230,87 @@
         <w:rPr>
           <w:rFonts w:ascii="Aptos" w:hAnsi="Aptos"/>
         </w:rPr>
+        <w:t xml:space="preserve">Appendix B - Certification Review Evidence</w:t>
+      </w:r>
+    </w:p>
+    <w:p>
+      <w:pPr>
+        <w:jc w:val="center"/>
+      </w:pPr>
+      <w:r>
+        <w:rPr>
+          <w:b/>
+          <w:color w:val="0078D4"/>
+          <w:sz w:val="22"/>
+        </w:rPr>
+        <w:t xml:space="preserve">Exhibit B5: Active Directory status (05/15/2026) of the approved accounts in exception</w:t>
+      </w:r>
+    </w:p>
+    <w:p>
+      <w:pPr>
+        <w:jc w:val="center"/>
+      </w:pPr>
+      <w:r>
+        <w:drawing>
+          <wp:inline xmlns:a="http://schemas.openxmlformats.org/drawingml/2006/main" xmlns:pic="http://schemas.openxmlformats.org/drawingml/2006/picture">
+            <wp:extent cx="6309360" cy="2414100"/>
+            <wp:docPr id="6" name="Picture 6"/>
+            <wp:cNvGraphicFramePr>
+              <a:graphicFrameLocks noChangeAspect="1"/>
+            </wp:cNvGraphicFramePr>
+            <a:graphic>
+              <a:graphicData uri="http://schemas.openxmlformats.org/drawingml/2006/picture">
+                <pic:pic>
+                  <pic:nvPicPr>
+                    <pic:cNvPr id="0" name="B5_ad_status.png"/>
+                    <pic:cNvPicPr/>
+                  </pic:nvPicPr>
+                  <pic:blipFill>
+                    <a:blip r:embed="rId28"/>
+                    <a:stretch>
+                      <a:fillRect/>
+                    </a:stretch>
+                  </pic:blipFill>
+                  <pic:spPr>
+                    <a:xfrm>
+                      <a:off x="0" y="0"/>
+                      <a:ext cx="6309360" cy="2414100"/>
+                    </a:xfrm>
+                    <a:prstGeom prst="rect"/>
+                  </pic:spPr>
+                </pic:pic>
+              </a:graphicData>
+            </a:graphic>
+          </wp:inline>
+        </w:drawing>
+      </w:r>
+    </w:p>
+    <w:p>
+      <w:pPr>
+        <w:jc w:val="center"/>
+      </w:pPr>
+      <w:r>
+        <w:rPr>
+          <w:i/>
+          <w:sz w:val="16"/>
+        </w:rPr>
+        <w:t xml:space="preserve">Source: BSI.IT.27.C7 New Testing Evidences-10-1--2026 / BSI.IT.27.C7.02 Q1 2026 Cert.xlsx (AD extract) (extract rendered from the source file)</w:t>
+      </w:r>
+    </w:p>
+    <w:p>
+      <w:r>
+        <w:br w:type="page"/>
+      </w:r>
+    </w:p>
+    <w:p>
+      <w:pPr>
+        <w:pStyle w:val="Heading1"/>
+        <w:spacing w:before="160" w:after="100"/>
+      </w:pPr>
+      <w:r>
+        <w:rPr>
+          <w:rFonts w:ascii="Aptos" w:hAnsi="Aptos"/>
+        </w:rPr>
         <w:t xml:space="preserve">Appendix C - Population and Frequency Evidence</w:t>
       </w:r>
     </w:p>
@@ -3919,7 +4371,21 @@
           <w:color w:val="1F1F1F"/>
           <w:sz w:val="17"/>
         </w:rPr>
-        <w:t xml:space="preserve">Certification campaigns evidenced for 2025 Q2, 2025 Q3 and 2026 Q2; 2025 Q4 and 2026 Q1 not provided</w:t>
+        <w:t xml:space="preserve">BSI AD extract 05/15/2026 reconciled to the 2026 Q2 certification (58/58) and the 2026 Q1 certification (all AD members certified; 3 revoked memberships removed)</w:t>
+      </w:r>
+    </w:p>
+    <w:p>
+      <w:pPr>
+        <w:pStyle w:val="ListBullet"/>
+        <w:spacing w:after="20" w:line="240" w:lineRule="auto"/>
+        <w:ind w:left="259" w:hanging="173"/>
+      </w:pPr>
+      <w:r>
+        <w:rPr>
+          <w:color w:val="1F1F1F"/>
+          <w:sz w:val="17"/>
+        </w:rPr>
+        <w:t xml:space="preserve">Certification campaigns evidenced for 2025 Q1, Q2, Q3, 2026 Q1 and 2026 Q2; 2025 Q4 not provided</w:t>
       </w:r>
     </w:p>
     <w:p>
@@ -3929,12 +4395,51 @@
     </w:p>
     <w:p>
       <w:r>
-        <w:t xml:space="preserve">Result: Pass (population); Pending (frequency)</w:t>
+        <w:t xml:space="preserve">Result: Pass (population); Pass with observation (frequency)</w:t>
       </w:r>
     </w:p>
     <w:p>
       <w:r>
-        <w:t xml:space="preserve">Conclusion: The certification population is complete for the four groups; the semiannual frequency requires the 2025 Q4 / 2026 Q1 certifications or management confirmation.</w:t>
+        <w:t xml:space="preserve">Conclusion: The certification population is complete for the four groups (AD 58/58); 2026 reviews were performed in April and July 2026; the missing 2025 Q4 review is reported as an observation.</w:t>
+      </w:r>
+    </w:p>
+    <w:p>
+      <w:pPr>
+        <w:jc w:val="center"/>
+      </w:pPr>
+      <w:r>
+        <w:drawing>
+          <wp:inline xmlns:a="http://schemas.openxmlformats.org/drawingml/2006/main" xmlns:pic="http://schemas.openxmlformats.org/drawingml/2006/picture">
+            <wp:extent cx="6309360" cy="1197161"/>
+            <wp:docPr id="7" name="Picture 7"/>
+            <wp:cNvGraphicFramePr>
+              <a:graphicFrameLocks noChangeAspect="1"/>
+            </wp:cNvGraphicFramePr>
+            <a:graphic>
+              <a:graphicData uri="http://schemas.openxmlformats.org/drawingml/2006/picture">
+                <pic:pic>
+                  <pic:nvPicPr>
+                    <pic:cNvPr id="0" name="C3_ad_recon.png"/>
+                    <pic:cNvPicPr/>
+                  </pic:nvPicPr>
+                  <pic:blipFill>
+                    <a:blip r:embed="rId29"/>
+                    <a:stretch>
+                      <a:fillRect/>
+                    </a:stretch>
+                  </pic:blipFill>
+                  <pic:spPr>
+                    <a:xfrm>
+                      <a:off x="0" y="0"/>
+                      <a:ext cx="6309360" cy="1197161"/>
+                    </a:xfrm>
+                    <a:prstGeom prst="rect"/>
+                  </pic:spPr>
+                </pic:pic>
+              </a:graphicData>
+            </a:graphic>
+          </wp:inline>
+        </w:drawing>
       </w:r>
     </w:p>
     <w:p>
@@ -3945,7 +4450,7 @@
         <w:drawing>
           <wp:inline xmlns:a="http://schemas.openxmlformats.org/drawingml/2006/main" xmlns:pic="http://schemas.openxmlformats.org/drawingml/2006/picture">
             <wp:extent cx="6309360" cy="2122593"/>
-            <wp:docPr id="6" name="Picture 6"/>
+            <wp:docPr id="8" name="Picture 8"/>
             <wp:cNvGraphicFramePr>
               <a:graphicFrameLocks noChangeAspect="1"/>
             </wp:cNvGraphicFramePr>
@@ -3957,7 +4462,7 @@
                     <pic:cNvPicPr/>
                   </pic:nvPicPr>
                   <pic:blipFill>
-                    <a:blip r:embed="rId28"/>
+                    <a:blip r:embed="rId30"/>
                     <a:stretch>
                       <a:fillRect/>
                     </a:stretch>
@@ -3983,8 +4488,8 @@
       <w:r>
         <w:drawing>
           <wp:inline xmlns:a="http://schemas.openxmlformats.org/drawingml/2006/main" xmlns:pic="http://schemas.openxmlformats.org/drawingml/2006/picture">
-            <wp:extent cx="6309360" cy="2126662"/>
-            <wp:docPr id="7" name="Picture 7"/>
+            <wp:extent cx="6309360" cy="1515240"/>
+            <wp:docPr id="9" name="Picture 9"/>
             <wp:cNvGraphicFramePr>
               <a:graphicFrameLocks noChangeAspect="1"/>
             </wp:cNvGraphicFramePr>
@@ -3996,7 +4501,7 @@
                     <pic:cNvPicPr/>
                   </pic:nvPicPr>
                   <pic:blipFill>
-                    <a:blip r:embed="rId29"/>
+                    <a:blip r:embed="rId31"/>
                     <a:stretch>
                       <a:fillRect/>
                     </a:stretch>
@@ -4004,7 +4509,7 @@
                   <pic:spPr>
                     <a:xfrm>
                       <a:off x="0" y="0"/>
-                      <a:ext cx="6309360" cy="2126662"/>
+                      <a:ext cx="6309360" cy="1515240"/>
                     </a:xfrm>
                     <a:prstGeom prst="rect"/>
                   </pic:spPr>
@@ -4029,7 +4534,7 @@
           <w:i/>
           <w:sz w:val="16"/>
         </w:rPr>
-        <w:t xml:space="preserve">Source: PAM BSI SOX and CyberArk certification exports 2025 Q2 and 2026 Q2 (extracts rendered from the source files); BSI.IT.27.C7.02 Q3_2025.</w:t>
+        <w:t xml:space="preserve">Source: BSI.IT.27.C7 New Testing Evidences-10-1--2026 - PAM BSI SOX and CyberArk certification exports, BSI.IT.27.C7.02 Q1 2026 Cert (AD extract) and Q3_2025 (extracts rendered from the source files).</w:t>
       </w:r>
     </w:p>
     <w:p>
@@ -4051,7 +4556,7 @@
     </w:p>
     <w:p>
       <w:r>
-        <w:t xml:space="preserve">IT RCSA validated the Network Device Admin Account Review control by confirming the privileged network AD groups against the PAM Definition of Privilege, verifying that the 2026 Q2 certification included all administrators, users and service accounts of those groups, that each membership was reviewed by the user's manager or the account owner and received a final decision, assessing whether approved access was appropriate using IAMS identity status and prior revocations, and rolling forward prior revocations to confirm removal within the 30-business-day SLA. Testing identified exceptions E1-E3 in CISCO Network Administrators and ISEAdmin; the frequency attribute remains pending the 2025 Q4 and 2026 Q1 certifications.</w:t>
+        <w:t xml:space="preserve">IT RCSA validated the Network Device Admin Account Review control by confirming the privileged network AD groups against the PAM Definition of Privilege, verifying that the 2026 Q2 certification included all administrators, users and service accounts of those groups, that each membership was reviewed by the user's manager or the account owner and received a final decision, assessing whether approved access was appropriate using IAMS identity status and prior revocations, and rolling forward prior revocations to confirm removal within the 30-business-day SLA. On October 1, 2026 the testing was updated with the BSI AD extract (05/15/2026), which confirmed completeness and the exceptions, and with the 2026 Q1 certification (a second sample with the same result). Exceptions E1-E3 were identified in CISCO Network Administrators and ISEAdmin.</w:t>
       </w:r>
     </w:p>
     <w:p>

</xml_diff>